<commit_message>
llm matching of fields to the standardized form
</commit_message>
<xml_diff>
--- a/check-target-net/DOCS/specs.docx
+++ b/check-target-net/DOCS/specs.docx
@@ -337,6 +337,84 @@
       </w:pPr>
       <w:r>
         <w:t>Focusing a source-column dropdown also selects that row as active.</w:t>
+      </w:r>
+    </w:p>
+    <w:p>
+      <w:pPr>
+        <w:pStyle w:val="Heading3"/>
+      </w:pPr>
+      <w:r>
+        <w:t>4.2.2 First-cut AI column mapping</w:t>
+      </w:r>
+    </w:p>
+    <w:p>
+      <w:pPr/>
+      <w:r>
+        <w:t>On Prepare, the app always asks the configured LLM for a first-cut mapping before showing Step 2:</w:t>
+      </w:r>
+    </w:p>
+    <w:p>
+      <w:pPr>
+        <w:pStyle w:val="ListBullet"/>
+      </w:pPr>
+      <w:r>
+        <w:t>The prompt includes base-format (target) headers, source headers, and up to 10 sample data rows from the uploaded sheet.</w:t>
+      </w:r>
+    </w:p>
+    <w:p>
+      <w:pPr>
+        <w:pStyle w:val="ListBullet"/>
+      </w:pPr>
+      <w:r>
+        <w:t>Suggested mappings pre-fill the Step 2 dropdowns; the user reviews and edits before Convert.</w:t>
+      </w:r>
+    </w:p>
+    <w:p>
+      <w:pPr>
+        <w:pStyle w:val="ListBullet"/>
+      </w:pPr>
+      <w:r>
+        <w:t>LLM source values must match exact source header strings; unknown or invented names are discarded (left blank).</w:t>
+      </w:r>
+    </w:p>
+    <w:p>
+      <w:pPr>
+        <w:pStyle w:val="ListBullet"/>
+      </w:pPr>
+      <w:r>
+        <w:t>Each source column may be assigned to at most one target. If the model (or sanitizer) would reuse a source, only the best-scoring target keeps it; other targets are left blank.</w:t>
+      </w:r>
+    </w:p>
+    <w:p>
+      <w:pPr>
+        <w:pStyle w:val="ListBullet"/>
+      </w:pPr>
+      <w:r>
+        <w:t>If the LLM call fails or returns invalid JSON, the UI falls back to case-insensitive exact-name matching and shows a non-blocking warning in the Prepare message.</w:t>
+      </w:r>
+    </w:p>
+    <w:p>
+      <w:pPr>
+        <w:pStyle w:val="ListBullet"/>
+      </w:pPr>
+      <w:r>
+        <w:t>DOMAIN HINT to the LLM: DESCRIPTION is a more general term; it fits better with [about Company] than with [Company primary products]. Products is more specific and less general than [about Company].</w:t>
+      </w:r>
+    </w:p>
+    <w:p>
+      <w:pPr>
+        <w:pStyle w:val="ListBullet"/>
+      </w:pPr>
+      <w:r>
+        <w:t>Step 1 selections are remembered (base format, last source file, sheet name, output filename) and restored on the next visit; the user can reuse the last chosen file.</w:t>
+      </w:r>
+    </w:p>
+    <w:p>
+      <w:pPr>
+        <w:pStyle w:val="ListBullet"/>
+      </w:pPr>
+      <w:r>
+        <w:t>While Prepare waits on the LLM, a slowly blinking “thinking…” message appears next to the Prepare column mapping button.</w:t>
       </w:r>
     </w:p>
     <w:p>

</xml_diff>